<commit_message>
Update project docs, bibliography, and evidence README
Add Office temp-file pattern (~$*) to .gitignore. Replace/refresh multiple deliverables and registry files (docx, pdf, xlsx) under documentos/, entregas/ and gestion/registros/ with updated versions. Revise evidencias/semana-01/README.md: rename section to "Identificación y evidencia independiente", update the members table with roles/placeholders and a note about pending confirmations, and mark initial checklist items as completed. Expand and correct fuentes/semana-01/bibliografia.md: fix Gao et al. author list and citation, and add several regulatory and data-protection references (MVCS, SST laws, ANPD, etc.).
</commit_message>
<xml_diff>
--- a/documentos/proyecto/Semana1_Proyecto_Integrador.docx
+++ b/documentos/proyecto/Semana1_Proyecto_Integrador.docx
@@ -182,10 +182,7 @@
           </w:tcPr>
           <w:p>
             <w:r>
-              <w:rPr>
-                <w:sz w:val="17"/>
-              </w:rPr>
-              <w:t>[Completar número de equipo] - 4 integrantes</w:t>
+              <w:t>Grupo 1 - 4 integrantes</w:t>
             </w:r>
           </w:p>
         </w:tc>
@@ -923,11 +920,7 @@
     </w:p>
     <w:p>
       <w:r>
-        <w:t xml:space="preserve">Para el proyecto se considerarán, cuando corresponda, obligaciones peruanas relacionadas con construcción, relaciones laborales, seguridad y salud en el trabajo, protección de datos y contratación. Las </w:t>
-      </w:r>
-      <w:r>
-        <w:lastRenderedPageBreak/>
-        <w:t>normas específicas se incorporarán únicamente cuando sean verificadas y resulten pertinentes para una decisión concreta.</w:t>
+        <w:t>Para las obras de edificación son aplicables el Reglamento Nacional de Edificaciones, aprobado por D.S. N.º 011-2006-VIVIENDA, y la Norma G.050 de Seguridad durante la Construcción. La gestión de trabajadores, contratistas y registros de obra debe considerar la Ley N.º 29783, su reglamento y el D.S. N.º 011-2019-TR para el sector construcción. Como el ERP procesa identidad, asistencia, horas y posiblemente información de clientes y proveedores, también corresponde evaluar la Ley N.º 29733 y su Reglamento aprobado por D.S. N.º 016-2024-JUS, vigente desde 2025, especialmente en finalidad, acceso, conservación, seguridad e incidentes. BIM no constituye una obligación general para proyectos privados; su exigencia debe verificarse cuando la empresa participe en inversiones públicas o contratos que lo requieran.</w:t>
       </w:r>
     </w:p>
     <w:p>
@@ -5326,10 +5319,7 @@
           </w:tcPr>
           <w:p>
             <w:r>
-              <w:rPr>
-                <w:sz w:val="17"/>
-              </w:rPr>
-              <w:t>Anonimiza a la organización de referencia.</w:t>
+              <w:t>Anonimiza a la organización de referencia. Fuente/evidencia: Definición académica del caso y criterio de anonimización del repositorio.</w:t>
             </w:r>
           </w:p>
         </w:tc>
@@ -5432,10 +5422,7 @@
           </w:tcPr>
           <w:p>
             <w:r>
-              <w:rPr>
-                <w:sz w:val="17"/>
-              </w:rPr>
-              <w:t>Basado en el levantamiento funcional observado.</w:t>
+              <w:t>Basado en el levantamiento funcional observado. Fuente/evidencia: Levantamiento funcional anonimizado; sección 3 del documento.</w:t>
             </w:r>
           </w:p>
         </w:tc>
@@ -5538,10 +5525,7 @@
           </w:tcPr>
           <w:p>
             <w:r>
-              <w:rPr>
-                <w:sz w:val="17"/>
-              </w:rPr>
-              <w:t>Basado en el levantamiento funcional.</w:t>
+              <w:t>Basado en el levantamiento funcional. Fuente/evidencia: Levantamiento funcional anonimizado; sección 3.1 del documento.</w:t>
             </w:r>
           </w:p>
         </w:tc>
@@ -5644,10 +5628,7 @@
           </w:tcPr>
           <w:p>
             <w:r>
-              <w:rPr>
-                <w:sz w:val="17"/>
-              </w:rPr>
-              <w:t>La suma de horas por actividad debe corresponder con las horas registradas.</w:t>
+              <w:t>La suma de horas por actividad debe corresponder con las horas registradas. Fuente/evidencia: Levantamiento funcional anonimizado; flujo AS-IS de la sección 3.</w:t>
             </w:r>
           </w:p>
         </w:tc>
@@ -5750,10 +5731,7 @@
           </w:tcPr>
           <w:p>
             <w:r>
-              <w:rPr>
-                <w:sz w:val="17"/>
-              </w:rPr>
-              <w:t>Permite obtener ratios/rendimientos.</w:t>
+              <w:t>Permite obtener ratios/rendimientos. Fuente/evidencia: Levantamiento funcional anonimizado; flujo AS-IS de la sección 3.</w:t>
             </w:r>
           </w:p>
         </w:tc>
@@ -5856,10 +5834,7 @@
           </w:tcPr>
           <w:p>
             <w:r>
-              <w:rPr>
-                <w:sz w:val="17"/>
-              </w:rPr>
-              <w:t>Basado en el levantamiento funcional.</w:t>
+              <w:t>Basado en el levantamiento funcional. Fuente/evidencia: Levantamiento funcional anonimizado; sección 3.1 del documento.</w:t>
             </w:r>
           </w:p>
         </w:tc>
@@ -5962,10 +5937,7 @@
           </w:tcPr>
           <w:p>
             <w:r>
-              <w:rPr>
-                <w:sz w:val="17"/>
-              </w:rPr>
-              <w:t>El detalle de integración se validará en semanas posteriores.</w:t>
+              <w:t>El detalle de integración se validará en semanas posteriores. Fuente/evidencia: Levantamiento funcional anonimizado; integración pendiente de validación.</w:t>
             </w:r>
           </w:p>
         </w:tc>
@@ -6068,10 +6040,7 @@
           </w:tcPr>
           <w:p>
             <w:r>
-              <w:rPr>
-                <w:sz w:val="17"/>
-              </w:rPr>
-              <w:t>Es el principal espacio de oportunidad identificado.</w:t>
+              <w:t>Es el principal espacio de oportunidad identificado. Fuente/evidencia: Levantamiento funcional anonimizado; brecha de la sección 3.3.</w:t>
             </w:r>
           </w:p>
         </w:tc>
@@ -6174,10 +6143,7 @@
           </w:tcPr>
           <w:p>
             <w:r>
-              <w:rPr>
-                <w:sz w:val="17"/>
-              </w:rPr>
-              <w:t>Se confirmará tamaño, roles y capacidades.</w:t>
+              <w:t>Se confirmará tamaño, roles y capacidades. Fuente/evidencia: Sin evidencia independiente; requiere entrevista o validación del equipo TI.</w:t>
             </w:r>
           </w:p>
         </w:tc>
@@ -6281,10 +6247,7 @@
           </w:tcPr>
           <w:p>
             <w:r>
-              <w:rPr>
-                <w:sz w:val="17"/>
-              </w:rPr>
-              <w:t>Protección de datos y confidencialidad.</w:t>
+              <w:t>Protección de datos y confidencialidad. Fuente/evidencia: Criterio de confidencialidad y protección de datos del repositorio.</w:t>
             </w:r>
           </w:p>
         </w:tc>
@@ -7519,6 +7482,266 @@
                 <w:sz w:val="17"/>
               </w:rPr>
               <w:t>T1, T8</w:t>
+            </w:r>
+          </w:p>
+        </w:tc>
+      </w:tr>
+      <w:tr>
+        <w:tc>
+          <w:tcPr>
+            <w:tcW w:type="dxa" w:w="1949"/>
+          </w:tcPr>
+          <w:p>
+            <w:r>
+              <w:t>F-15</w:t>
+            </w:r>
+          </w:p>
+        </w:tc>
+        <w:tc>
+          <w:tcPr>
+            <w:tcW w:type="dxa" w:w="1949"/>
+          </w:tcPr>
+          <w:p>
+            <w:r>
+              <w:t>RNE y Norma G.050</w:t>
+            </w:r>
+          </w:p>
+        </w:tc>
+        <w:tc>
+          <w:tcPr>
+            <w:tcW w:type="dxa" w:w="1949"/>
+          </w:tcPr>
+          <w:p>
+            <w:r>
+              <w:t>1</w:t>
+            </w:r>
+          </w:p>
+        </w:tc>
+        <w:tc>
+          <w:tcPr>
+            <w:tcW w:type="dxa" w:w="1949"/>
+          </w:tcPr>
+          <w:p>
+            <w:r>
+              <w:t>Marco técnico y seguridad durante la construcción.</w:t>
+            </w:r>
+          </w:p>
+        </w:tc>
+        <w:tc>
+          <w:tcPr>
+            <w:tcW w:type="dxa" w:w="1949"/>
+          </w:tcPr>
+          <w:p>
+            <w:r>
+              <w:t>Contexto regulatorio</w:t>
+            </w:r>
+          </w:p>
+        </w:tc>
+      </w:tr>
+      <w:tr>
+        <w:tc>
+          <w:tcPr>
+            <w:tcW w:type="dxa" w:w="1949"/>
+          </w:tcPr>
+          <w:p>
+            <w:r>
+              <w:t>F-16</w:t>
+            </w:r>
+          </w:p>
+        </w:tc>
+        <w:tc>
+          <w:tcPr>
+            <w:tcW w:type="dxa" w:w="1949"/>
+          </w:tcPr>
+          <w:p>
+            <w:r>
+              <w:t>Ley N.º 29783</w:t>
+            </w:r>
+          </w:p>
+        </w:tc>
+        <w:tc>
+          <w:tcPr>
+            <w:tcW w:type="dxa" w:w="1949"/>
+          </w:tcPr>
+          <w:p>
+            <w:r>
+              <w:t>1</w:t>
+            </w:r>
+          </w:p>
+        </w:tc>
+        <w:tc>
+          <w:tcPr>
+            <w:tcW w:type="dxa" w:w="1949"/>
+          </w:tcPr>
+          <w:p>
+            <w:r>
+              <w:t>Seguridad y salud en el trabajo.</w:t>
+            </w:r>
+          </w:p>
+        </w:tc>
+        <w:tc>
+          <w:tcPr>
+            <w:tcW w:type="dxa" w:w="1949"/>
+          </w:tcPr>
+          <w:p>
+            <w:r>
+              <w:t>Contexto regulatorio</w:t>
+            </w:r>
+          </w:p>
+        </w:tc>
+      </w:tr>
+      <w:tr>
+        <w:tc>
+          <w:tcPr>
+            <w:tcW w:type="dxa" w:w="1949"/>
+          </w:tcPr>
+          <w:p>
+            <w:r>
+              <w:t>F-17</w:t>
+            </w:r>
+          </w:p>
+        </w:tc>
+        <w:tc>
+          <w:tcPr>
+            <w:tcW w:type="dxa" w:w="1949"/>
+          </w:tcPr>
+          <w:p>
+            <w:r>
+              <w:t>D.S. N.º 011-2019-TR</w:t>
+            </w:r>
+          </w:p>
+        </w:tc>
+        <w:tc>
+          <w:tcPr>
+            <w:tcW w:type="dxa" w:w="1949"/>
+          </w:tcPr>
+          <w:p>
+            <w:r>
+              <w:t>1</w:t>
+            </w:r>
+          </w:p>
+        </w:tc>
+        <w:tc>
+          <w:tcPr>
+            <w:tcW w:type="dxa" w:w="1949"/>
+          </w:tcPr>
+          <w:p>
+            <w:r>
+              <w:t>SST para el sector construcción.</w:t>
+            </w:r>
+          </w:p>
+        </w:tc>
+        <w:tc>
+          <w:tcPr>
+            <w:tcW w:type="dxa" w:w="1949"/>
+          </w:tcPr>
+          <w:p>
+            <w:r>
+              <w:t>Contexto regulatorio</w:t>
+            </w:r>
+          </w:p>
+        </w:tc>
+      </w:tr>
+      <w:tr>
+        <w:tc>
+          <w:tcPr>
+            <w:tcW w:type="dxa" w:w="1949"/>
+          </w:tcPr>
+          <w:p>
+            <w:r>
+              <w:t>F-18</w:t>
+            </w:r>
+          </w:p>
+        </w:tc>
+        <w:tc>
+          <w:tcPr>
+            <w:tcW w:type="dxa" w:w="1949"/>
+          </w:tcPr>
+          <w:p>
+            <w:r>
+              <w:t>Ley N.º 29733</w:t>
+            </w:r>
+          </w:p>
+        </w:tc>
+        <w:tc>
+          <w:tcPr>
+            <w:tcW w:type="dxa" w:w="1949"/>
+          </w:tcPr>
+          <w:p>
+            <w:r>
+              <w:t>1</w:t>
+            </w:r>
+          </w:p>
+        </w:tc>
+        <w:tc>
+          <w:tcPr>
+            <w:tcW w:type="dxa" w:w="1949"/>
+          </w:tcPr>
+          <w:p>
+            <w:r>
+              <w:t>Protección de datos tratados por el ERP.</w:t>
+            </w:r>
+          </w:p>
+        </w:tc>
+        <w:tc>
+          <w:tcPr>
+            <w:tcW w:type="dxa" w:w="1949"/>
+          </w:tcPr>
+          <w:p>
+            <w:r>
+              <w:t>Contexto regulatorio</w:t>
+            </w:r>
+          </w:p>
+        </w:tc>
+      </w:tr>
+      <w:tr>
+        <w:tc>
+          <w:tcPr>
+            <w:tcW w:type="dxa" w:w="1949"/>
+          </w:tcPr>
+          <w:p>
+            <w:r>
+              <w:t>F-19</w:t>
+            </w:r>
+          </w:p>
+        </w:tc>
+        <w:tc>
+          <w:tcPr>
+            <w:tcW w:type="dxa" w:w="1949"/>
+          </w:tcPr>
+          <w:p>
+            <w:r>
+              <w:t>D.S. N.º 016-2024-JUS</w:t>
+            </w:r>
+          </w:p>
+        </w:tc>
+        <w:tc>
+          <w:tcPr>
+            <w:tcW w:type="dxa" w:w="1949"/>
+          </w:tcPr>
+          <w:p>
+            <w:r>
+              <w:t>1</w:t>
+            </w:r>
+          </w:p>
+        </w:tc>
+        <w:tc>
+          <w:tcPr>
+            <w:tcW w:type="dxa" w:w="1949"/>
+          </w:tcPr>
+          <w:p>
+            <w:r>
+              <w:t>Reglamento vigente de protección de datos.</w:t>
+            </w:r>
+          </w:p>
+        </w:tc>
+        <w:tc>
+          <w:tcPr>
+            <w:tcW w:type="dxa" w:w="1949"/>
+          </w:tcPr>
+          <w:p>
+            <w:r>
+              <w:t>Contexto regulatorio</w:t>
             </w:r>
           </w:p>
         </w:tc>
@@ -8672,7 +8895,7 @@
         <w:ind w:left="567" w:hanging="567"/>
       </w:pPr>
       <w:r>
-        <w:t>Gao, Y., Antwi-Afari, M. F., Huang, Y., &amp; Chen, Z.-S. (2026). Artificial Intelligence in Construction Project Management: A Systematic Literature Review of Cost, Time, and Safety Management. Buildings, 16(5), 1061. https://doi.org/10.3390/buildings16051061</w:t>
+        <w:t>Gao, Y., Antwi-Afari, M. F., Huang, Y., Chen, Z.-S., &amp; Manzoor, B. (2026). Artificial Intelligence in Construction Project Management: A Systematic Literature Review of Cost, Time, and Safety Management. Buildings, 16(5), 1061. https://doi.org/10.3390/buildings16051061</w:t>
       </w:r>
     </w:p>
     <w:p>
@@ -8736,6 +8959,36 @@
     <w:p>
       <w:r>
         <w:t>Thoughtworks. (2025b). Technology Radar, Volume 33. https://www.thoughtworks.com/content/dam/thoughtworks/documents/radar/2025/11/tr_technology_radar_vol_33_en.pdf</w:t>
+      </w:r>
+    </w:p>
+    <w:p>
+      <w:pPr/>
+      <w:r>
+        <w:t>Autoridad Nacional de Protección de Datos Personales. (2024). Decreto Supremo N.º 016-2024-JUS, Reglamento de la Ley N.º 29733. https://www.gob.pe/institucion/anpd/normas-legales/6554453-16-2024-jus</w:t>
+      </w:r>
+    </w:p>
+    <w:p>
+      <w:pPr/>
+      <w:r>
+        <w:t>Congreso de la República. (2011a). Ley N.º 29733, Ley de Protección de Datos Personales. https://www.gob.pe/institucion/congreso-de-la-republica/normas-legales/243470-29733</w:t>
+      </w:r>
+    </w:p>
+    <w:p>
+      <w:pPr/>
+      <w:r>
+        <w:t>Congreso de la República. (2011b). Ley N.º 29783, Ley de Seguridad y Salud en el Trabajo. https://www.gob.pe/institucion/congreso-de-la-republica/normas-legales/462576-29783</w:t>
+      </w:r>
+    </w:p>
+    <w:p>
+      <w:pPr/>
+      <w:r>
+        <w:t>Ministerio de Trabajo y Promoción del Empleo. (2019). Decreto Supremo N.º 011-2019-TR, Reglamento de Seguridad y Salud en el Trabajo para el Sector Construcción. https://www.gob.pe/institucion/mtpe/normas-legales/284237-011-2019-tr</w:t>
+      </w:r>
+    </w:p>
+    <w:p>
+      <w:pPr/>
+      <w:r>
+        <w:t>Ministerio de Vivienda, Construcción y Saneamiento. (2006, actualizado). Reglamento Nacional de Edificaciones. https://www.gob.pe/institucion/vivienda/informes-publicaciones/2309793-reglamento-nacional-de-edificaciones-rne</w:t>
       </w:r>
     </w:p>
     <w:p>

</xml_diff>